<commit_message>
docs: add a terminal install path and the MIT license
The public README walks through clone, build and a first pod, and the mesh section matches mTLS and the CSR join.

Co-authored-by: Cursor <cursoragent@cursor.com>
</commit_message>
<xml_diff>
--- a/docs/RustyPods-overzicht.docx
+++ b/docs/RustyPods-overzicht.docx
@@ -5198,7 +5198,408 @@
       </w:pPr>
       <w:r>
         <w:rPr/>
-        <w:t>11. A short command tour</w:t>
+        <w:t>11. Install from a terminal</w:t>
+      </w:r>
+    </w:p>
+    <w:p>
+      <w:pPr>
+        <w:pStyle w:val="BodyText"/>
+        <w:bidi w:val="0"/>
+        <w:spacing w:before="0" w:after="283"/>
+        <w:jc w:val="left"/>
+        <w:rPr/>
+      </w:pPr>
+      <w:r>
+        <w:rPr/>
+        <w:t>Build on the machine that will run the daemon. A binary from Debian 13 needs glibc 2.39 and does not run on AlmaLinux 9. The host must boot systemd as PID 1, on cgroup v2, with machined.</w:t>
+      </w:r>
+    </w:p>
+    <w:p>
+      <w:pPr>
+        <w:pStyle w:val="BodyText"/>
+        <w:bidi w:val="0"/>
+        <w:spacing w:before="0" w:after="283"/>
+        <w:jc w:val="left"/>
+        <w:rPr/>
+      </w:pPr>
+      <w:r>
+        <w:rPr/>
+        <w:t xml:space="preserve">On Debian or Ubuntu, install a compiler, </w:t>
+      </w:r>
+      <w:r>
+        <w:rPr>
+          <w:rStyle w:val="Brontekst"/>
+        </w:rPr>
+        <w:t>mold</w:t>
+      </w:r>
+      <w:r>
+        <w:rPr/>
+        <w:t>, and Rust:</w:t>
+      </w:r>
+    </w:p>
+    <w:p>
+      <w:pPr>
+        <w:pStyle w:val="Reedsopgemaaktetekst"/>
+        <w:pBdr>
+          <w:left w:val="single" w:sz="24" w:space="9" w:color="0B3D66"/>
+        </w:pBdr>
+        <w:bidi w:val="0"/>
+        <w:spacing w:before="0" w:after="0"/>
+        <w:jc w:val="left"/>
+        <w:rPr/>
+      </w:pPr>
+      <w:r>
+        <w:rPr>
+          <w:rStyle w:val="Brontekst"/>
+        </w:rPr>
+        <w:t>sudo apt install build-essential mold pkg-config curl ca-certificates</w:t>
+      </w:r>
+    </w:p>
+    <w:p>
+      <w:pPr>
+        <w:pStyle w:val="Reedsopgemaaktetekst"/>
+        <w:pBdr>
+          <w:left w:val="single" w:sz="24" w:space="9" w:color="0B3D66"/>
+        </w:pBdr>
+        <w:bidi w:val="0"/>
+        <w:spacing w:before="0" w:after="0"/>
+        <w:jc w:val="left"/>
+        <w:rPr/>
+      </w:pPr>
+      <w:r>
+        <w:rPr>
+          <w:rStyle w:val="Brontekst"/>
+        </w:rPr>
+        <w:t>curl --proto '=https' --tlsv1.2 -sSf https://sh.rustup.rs | sh</w:t>
+      </w:r>
+    </w:p>
+    <w:p>
+      <w:pPr>
+        <w:pStyle w:val="Reedsopgemaaktetekst"/>
+        <w:bidi w:val="0"/>
+        <w:spacing w:before="0" w:after="283"/>
+        <w:jc w:val="left"/>
+        <w:rPr/>
+      </w:pPr>
+      <w:r>
+        <w:rPr>
+          <w:rStyle w:val="Brontekst"/>
+        </w:rPr>
+        <w:t>. "$HOME/.cargo/env"</w:t>
+      </w:r>
+    </w:p>
+    <w:p>
+      <w:pPr>
+        <w:pStyle w:val="BodyText"/>
+        <w:bidi w:val="0"/>
+        <w:spacing w:before="0" w:after="283"/>
+        <w:jc w:val="left"/>
+        <w:rPr/>
+      </w:pPr>
+      <w:r>
+        <w:rPr/>
+        <w:t xml:space="preserve">On Fedora, the package line is </w:t>
+      </w:r>
+      <w:r>
+        <w:rPr>
+          <w:rStyle w:val="Brontekst"/>
+        </w:rPr>
+        <w:t>sudo dnf install gcc mold pkgconf curl ca-certificates</w:t>
+      </w:r>
+      <w:r>
+        <w:rPr/>
+        <w:t xml:space="preserve">. On Arch Linux, install </w:t>
+      </w:r>
+      <w:r>
+        <w:rPr>
+          <w:rStyle w:val="Brontekst"/>
+        </w:rPr>
+        <w:t>base-devel</w:t>
+      </w:r>
+      <w:r>
+        <w:rPr/>
+        <w:t xml:space="preserve">, </w:t>
+      </w:r>
+      <w:r>
+        <w:rPr>
+          <w:rStyle w:val="Brontekst"/>
+        </w:rPr>
+        <w:t>mold</w:t>
+      </w:r>
+      <w:r>
+        <w:rPr/>
+        <w:t xml:space="preserve"> and </w:t>
+      </w:r>
+      <w:r>
+        <w:rPr>
+          <w:rStyle w:val="Brontekst"/>
+        </w:rPr>
+        <w:t>rustup</w:t>
+      </w:r>
+      <w:r>
+        <w:rPr/>
+        <w:t>.</w:t>
+      </w:r>
+    </w:p>
+    <w:p>
+      <w:pPr>
+        <w:pStyle w:val="Reedsopgemaaktetekst"/>
+        <w:pBdr>
+          <w:left w:val="single" w:sz="24" w:space="9" w:color="0B3D66"/>
+        </w:pBdr>
+        <w:bidi w:val="0"/>
+        <w:spacing w:before="0" w:after="0"/>
+        <w:jc w:val="left"/>
+        <w:rPr/>
+      </w:pPr>
+      <w:r>
+        <w:rPr>
+          <w:rStyle w:val="Brontekst"/>
+        </w:rPr>
+        <w:t>git clone https://github.com/monsma-dev/rustypods.git</w:t>
+      </w:r>
+    </w:p>
+    <w:p>
+      <w:pPr>
+        <w:pStyle w:val="Reedsopgemaaktetekst"/>
+        <w:pBdr>
+          <w:left w:val="single" w:sz="24" w:space="9" w:color="0B3D66"/>
+        </w:pBdr>
+        <w:bidi w:val="0"/>
+        <w:spacing w:before="0" w:after="0"/>
+        <w:jc w:val="left"/>
+        <w:rPr/>
+      </w:pPr>
+      <w:r>
+        <w:rPr>
+          <w:rStyle w:val="Brontekst"/>
+        </w:rPr>
+        <w:t>cd rustypods</w:t>
+      </w:r>
+    </w:p>
+    <w:p>
+      <w:pPr>
+        <w:pStyle w:val="Reedsopgemaaktetekst"/>
+        <w:pBdr>
+          <w:left w:val="single" w:sz="24" w:space="9" w:color="0B3D66"/>
+        </w:pBdr>
+        <w:bidi w:val="0"/>
+        <w:spacing w:before="0" w:after="0"/>
+        <w:jc w:val="left"/>
+        <w:rPr/>
+      </w:pPr>
+      <w:r>
+        <w:rPr>
+          <w:rStyle w:val="Brontekst"/>
+        </w:rPr>
+        <w:t>bash scripts/build.sh</w:t>
+      </w:r>
+    </w:p>
+    <w:p>
+      <w:pPr>
+        <w:pStyle w:val="Reedsopgemaaktetekst"/>
+        <w:pBdr>
+          <w:left w:val="single" w:sz="24" w:space="9" w:color="0B3D66"/>
+        </w:pBdr>
+        <w:bidi w:val="0"/>
+        <w:spacing w:before="0" w:after="0"/>
+        <w:jc w:val="left"/>
+        <w:rPr/>
+      </w:pPr>
+      <w:r>
+        <w:rPr>
+          <w:rStyle w:val="Brontekst"/>
+        </w:rPr>
+        <w:t>sudo bash scripts/install-daemon.sh --user "$USER"</w:t>
+      </w:r>
+    </w:p>
+    <w:p>
+      <w:pPr>
+        <w:pStyle w:val="Reedsopgemaaktetekst"/>
+        <w:pBdr>
+          <w:left w:val="single" w:sz="24" w:space="9" w:color="0B3D66"/>
+        </w:pBdr>
+        <w:bidi w:val="0"/>
+        <w:spacing w:before="0" w:after="0"/>
+        <w:jc w:val="left"/>
+        <w:rPr/>
+      </w:pPr>
+      <w:r>
+        <w:rPr>
+          <w:rStyle w:val="Brontekst"/>
+        </w:rPr>
+        <w:t>rustypods doctor</w:t>
+      </w:r>
+    </w:p>
+    <w:p>
+      <w:pPr>
+        <w:pStyle w:val="Reedsopgemaaktetekst"/>
+        <w:pBdr>
+          <w:left w:val="single" w:sz="24" w:space="9" w:color="0B3D66"/>
+        </w:pBdr>
+        <w:bidi w:val="0"/>
+        <w:spacing w:before="0" w:after="0"/>
+        <w:jc w:val="left"/>
+        <w:rPr/>
+      </w:pPr>
+      <w:r>
+        <w:rPr/>
+      </w:r>
+    </w:p>
+    <w:p>
+      <w:pPr>
+        <w:pStyle w:val="Reedsopgemaaktetekst"/>
+        <w:pBdr>
+          <w:left w:val="single" w:sz="24" w:space="9" w:color="0B3D66"/>
+        </w:pBdr>
+        <w:bidi w:val="0"/>
+        <w:spacing w:before="0" w:after="0"/>
+        <w:jc w:val="left"/>
+        <w:rPr/>
+      </w:pPr>
+      <w:r>
+        <w:rPr>
+          <w:rStyle w:val="Brontekst"/>
+        </w:rPr>
+        <w:t>rustypods pull docker.io/library/debian:trixie</w:t>
+      </w:r>
+    </w:p>
+    <w:p>
+      <w:pPr>
+        <w:pStyle w:val="Reedsopgemaaktetekst"/>
+        <w:pBdr>
+          <w:left w:val="single" w:sz="24" w:space="9" w:color="0B3D66"/>
+        </w:pBdr>
+        <w:bidi w:val="0"/>
+        <w:spacing w:before="0" w:after="0"/>
+        <w:jc w:val="left"/>
+        <w:rPr/>
+      </w:pPr>
+      <w:r>
+        <w:rPr>
+          <w:rStyle w:val="Brontekst"/>
+        </w:rPr>
+        <w:t>rustypods create app --image debian-trixie --port 8080:8080</w:t>
+      </w:r>
+    </w:p>
+    <w:p>
+      <w:pPr>
+        <w:pStyle w:val="Reedsopgemaaktetekst"/>
+        <w:pBdr>
+          <w:left w:val="single" w:sz="24" w:space="9" w:color="0B3D66"/>
+        </w:pBdr>
+        <w:bidi w:val="0"/>
+        <w:spacing w:before="0" w:after="0"/>
+        <w:jc w:val="left"/>
+        <w:rPr/>
+      </w:pPr>
+      <w:r>
+        <w:rPr>
+          <w:rStyle w:val="Brontekst"/>
+        </w:rPr>
+        <w:t>rustypods start app --memory-high 2G</w:t>
+      </w:r>
+    </w:p>
+    <w:p>
+      <w:pPr>
+        <w:pStyle w:val="Reedsopgemaaktetekst"/>
+        <w:bidi w:val="0"/>
+        <w:spacing w:before="0" w:after="283"/>
+        <w:jc w:val="left"/>
+        <w:rPr/>
+      </w:pPr>
+      <w:r>
+        <w:rPr>
+          <w:rStyle w:val="Brontekst"/>
+        </w:rPr>
+        <w:t>rustypods ps</w:t>
+      </w:r>
+    </w:p>
+    <w:p>
+      <w:pPr>
+        <w:pStyle w:val="BodyText"/>
+        <w:bidi w:val="0"/>
+        <w:spacing w:before="0" w:after="283"/>
+        <w:jc w:val="left"/>
+        <w:rPr/>
+      </w:pPr>
+      <w:r>
+        <w:rPr>
+          <w:rStyle w:val="Brontekst"/>
+        </w:rPr>
+        <w:t>scripts/build.sh</w:t>
+      </w:r>
+      <w:r>
+        <w:rPr/>
+        <w:t xml:space="preserve"> compiles the release binaries and runs the tests. The installer adds nftables, iproute, util-linux, btrfs-progs, socat and the nspawn package for that distro, then starts </w:t>
+      </w:r>
+      <w:r>
+        <w:rPr>
+          <w:rStyle w:val="Brontekst"/>
+        </w:rPr>
+        <w:t>rustypodsd</w:t>
+      </w:r>
+      <w:r>
+        <w:rPr/>
+        <w:t xml:space="preserve">. Your user is the administrator of the local socket. </w:t>
+      </w:r>
+      <w:r>
+        <w:rPr>
+          <w:rStyle w:val="Brontekst"/>
+        </w:rPr>
+        <w:t>bash scripts/install-daemon.sh --dry-run --user "$USER"</w:t>
+      </w:r>
+      <w:r>
+        <w:rPr/>
+        <w:t xml:space="preserve"> prints the plan and changes nothing. </w:t>
+      </w:r>
+      <w:r>
+        <w:rPr>
+          <w:rStyle w:val="Brontekst"/>
+        </w:rPr>
+        <w:t>sudo bash scripts/uninstall-daemon.sh</w:t>
+      </w:r>
+      <w:r>
+        <w:rPr/>
+        <w:t xml:space="preserve"> removes the unit and keeps </w:t>
+      </w:r>
+      <w:r>
+        <w:rPr>
+          <w:rStyle w:val="Brontekst"/>
+        </w:rPr>
+        <w:t>/var/lib/rustypods</w:t>
+      </w:r>
+      <w:r>
+        <w:rPr/>
+        <w:t xml:space="preserve"> unless you pass </w:t>
+      </w:r>
+      <w:r>
+        <w:rPr>
+          <w:rStyle w:val="Brontekst"/>
+        </w:rPr>
+        <w:t>--purge-data</w:t>
+      </w:r>
+      <w:r>
+        <w:rPr/>
+        <w:t>.</w:t>
+      </w:r>
+    </w:p>
+    <w:p>
+      <w:pPr>
+        <w:pStyle w:val="Heading2"/>
+        <w:numPr>
+          <w:ilvl w:val="0"/>
+          <w:numId w:val="0"/>
+        </w:numPr>
+        <w:pBdr/>
+        <w:bidi w:val="0"/>
+        <w:spacing w:before="390" w:after="120"/>
+        <w:jc w:val="left"/>
+        <w:rPr/>
+      </w:pPr>
+      <w:r>
+        <w:rPr/>
+        <w:t>12. A short command tour</w:t>
       </w:r>
     </w:p>
     <w:p>

</xml_diff>